<commit_message>
Added comments, documentation, improved code
</commit_message>
<xml_diff>
--- a/Documentation.docx
+++ b/Documentation.docx
@@ -1029,6 +1029,14 @@
     </w:sdt>
     <w:sdt>
       <w:sdtPr>
+        <w:rPr>
+          <w:rFonts w:asciiTheme="minorHAnsi" w:eastAsiaTheme="minorHAnsi" w:hAnsiTheme="minorHAnsi" w:cstheme="minorBidi"/>
+          <w:color w:val="auto"/>
+          <w:sz w:val="22"/>
+          <w:szCs w:val="22"/>
+          <w:lang w:val="en-GB"/>
+          <w14:ligatures w14:val="standardContextual"/>
+        </w:rPr>
         <w:id w:val="2136295062"/>
         <w:docPartObj>
           <w:docPartGallery w:val="Table of Contents"/>
@@ -1037,15 +1045,9 @@
       </w:sdtPr>
       <w:sdtEndPr>
         <w:rPr>
-          <w:rFonts w:asciiTheme="minorHAnsi" w:eastAsiaTheme="minorHAnsi" w:hAnsiTheme="minorHAnsi" w:cstheme="minorBidi"/>
           <w:b/>
           <w:bCs/>
           <w:noProof/>
-          <w:color w:val="auto"/>
-          <w:sz w:val="22"/>
-          <w:szCs w:val="22"/>
-          <w:lang w:val="en-GB"/>
-          <w14:ligatures w14:val="standardContextual"/>
         </w:rPr>
       </w:sdtEndPr>
       <w:sdtContent>
@@ -2279,7 +2281,7 @@
                 <w:noProof/>
                 <w:webHidden/>
               </w:rPr>
-              <w:t>13</w:t>
+              <w:t>14</w:t>
             </w:r>
             <w:r>
               <w:rPr>
@@ -2347,7 +2349,7 @@
                 <w:noProof/>
                 <w:webHidden/>
               </w:rPr>
-              <w:t>13</w:t>
+              <w:t>14</w:t>
             </w:r>
             <w:r>
               <w:rPr>
@@ -2415,7 +2417,7 @@
                 <w:noProof/>
                 <w:webHidden/>
               </w:rPr>
-              <w:t>13</w:t>
+              <w:t>14</w:t>
             </w:r>
             <w:r>
               <w:rPr>
@@ -2755,7 +2757,7 @@
                 <w:noProof/>
                 <w:webHidden/>
               </w:rPr>
-              <w:t>14</w:t>
+              <w:t>15</w:t>
             </w:r>
             <w:r>
               <w:rPr>
@@ -2823,7 +2825,7 @@
                 <w:noProof/>
                 <w:webHidden/>
               </w:rPr>
-              <w:t>14</w:t>
+              <w:t>15</w:t>
             </w:r>
             <w:r>
               <w:rPr>
@@ -3163,7 +3165,7 @@
                 <w:noProof/>
                 <w:webHidden/>
               </w:rPr>
-              <w:t>15</w:t>
+              <w:t>16</w:t>
             </w:r>
             <w:r>
               <w:rPr>
@@ -3231,7 +3233,7 @@
                 <w:noProof/>
                 <w:webHidden/>
               </w:rPr>
-              <w:t>15</w:t>
+              <w:t>16</w:t>
             </w:r>
             <w:r>
               <w:rPr>
@@ -3367,7 +3369,7 @@
                 <w:noProof/>
                 <w:webHidden/>
               </w:rPr>
-              <w:t>16</w:t>
+              <w:t>17</w:t>
             </w:r>
             <w:r>
               <w:rPr>
@@ -3435,7 +3437,7 @@
                 <w:noProof/>
                 <w:webHidden/>
               </w:rPr>
-              <w:t>17</w:t>
+              <w:t>18</w:t>
             </w:r>
             <w:r>
               <w:rPr>
@@ -3503,7 +3505,7 @@
                 <w:noProof/>
                 <w:webHidden/>
               </w:rPr>
-              <w:t>17</w:t>
+              <w:t>18</w:t>
             </w:r>
             <w:r>
               <w:rPr>
@@ -3571,7 +3573,7 @@
                 <w:noProof/>
                 <w:webHidden/>
               </w:rPr>
-              <w:t>18</w:t>
+              <w:t>19</w:t>
             </w:r>
             <w:r>
               <w:rPr>
@@ -3639,7 +3641,7 @@
                 <w:noProof/>
                 <w:webHidden/>
               </w:rPr>
-              <w:t>18</w:t>
+              <w:t>19</w:t>
             </w:r>
             <w:r>
               <w:rPr>
@@ -3707,7 +3709,7 @@
                 <w:noProof/>
                 <w:webHidden/>
               </w:rPr>
-              <w:t>18</w:t>
+              <w:t>19</w:t>
             </w:r>
             <w:r>
               <w:rPr>
@@ -3775,7 +3777,7 @@
                 <w:noProof/>
                 <w:webHidden/>
               </w:rPr>
-              <w:t>18</w:t>
+              <w:t>19</w:t>
             </w:r>
             <w:r>
               <w:rPr>
@@ -3843,7 +3845,7 @@
                 <w:noProof/>
                 <w:webHidden/>
               </w:rPr>
-              <w:t>18</w:t>
+              <w:t>19</w:t>
             </w:r>
             <w:r>
               <w:rPr>
@@ -3911,7 +3913,7 @@
                 <w:noProof/>
                 <w:webHidden/>
               </w:rPr>
-              <w:t>18</w:t>
+              <w:t>19</w:t>
             </w:r>
             <w:r>
               <w:rPr>
@@ -3979,7 +3981,7 @@
                 <w:noProof/>
                 <w:webHidden/>
               </w:rPr>
-              <w:t>18</w:t>
+              <w:t>20</w:t>
             </w:r>
             <w:r>
               <w:rPr>
@@ -4047,7 +4049,7 @@
                 <w:noProof/>
                 <w:webHidden/>
               </w:rPr>
-              <w:t>19</w:t>
+              <w:t>20</w:t>
             </w:r>
             <w:r>
               <w:rPr>
@@ -5003,6 +5005,9 @@
         <w:jc w:val="center"/>
       </w:pPr>
       <w:r>
+        <w:rPr>
+          <w:noProof/>
+        </w:rPr>
         <w:drawing>
           <wp:inline distT="0" distB="0" distL="0" distR="0" wp14:anchorId="227E085F" wp14:editId="72EA3D17">
             <wp:extent cx="1540371" cy="1617134"/>
@@ -5042,13 +5047,7 @@
     </w:p>
     <w:p>
       <w:r>
-        <w:t>To view the outliers in the numerical fields, I then created boxplots.</w:t>
-      </w:r>
-      <w:r>
-        <w:t xml:space="preserve"> </w:t>
-      </w:r>
-      <w:r>
-        <w:t xml:space="preserve">I chose not to eliminate any outliers even though the boxplots display outliers because there are too many points listed outside of the box. </w:t>
+        <w:t xml:space="preserve">To view the outliers in the numerical fields, I then created boxplots. I chose not to eliminate any outliers even though the boxplots display outliers because there are too many points listed outside of the box. </w:t>
       </w:r>
     </w:p>
     <w:p>
@@ -5088,6 +5087,9 @@
         <w:br/>
       </w:r>
       <w:r>
+        <w:rPr>
+          <w:noProof/>
+        </w:rPr>
         <w:drawing>
           <wp:inline distT="0" distB="0" distL="0" distR="0" wp14:anchorId="616F4ECC" wp14:editId="6479CFC6">
             <wp:extent cx="3560495" cy="2235200"/>
@@ -5149,6 +5151,9 @@
         <w:t>This is also unclear because it displays comparable patterns for both True and False Revenue.</w:t>
       </w:r>
       <w:r>
+        <w:rPr>
+          <w:noProof/>
+        </w:rPr>
         <w:drawing>
           <wp:inline distT="0" distB="0" distL="0" distR="0" wp14:anchorId="284EE658" wp14:editId="6D911986">
             <wp:extent cx="3259667" cy="2319030"/>
@@ -5197,6 +5202,9 @@
         <w:jc w:val="center"/>
       </w:pPr>
       <w:r>
+        <w:rPr>
+          <w:noProof/>
+        </w:rPr>
         <w:drawing>
           <wp:inline distT="0" distB="0" distL="0" distR="0" wp14:anchorId="12F61322" wp14:editId="6506E6E8">
             <wp:extent cx="4648200" cy="3058079"/>
@@ -5248,6 +5256,9 @@
         <w:jc w:val="center"/>
       </w:pPr>
       <w:r>
+        <w:rPr>
+          <w:noProof/>
+        </w:rPr>
         <w:drawing>
           <wp:inline distT="0" distB="0" distL="0" distR="0" wp14:anchorId="08FBC1DC" wp14:editId="1A673BFA">
             <wp:extent cx="4521200" cy="3172463"/>
@@ -5295,6 +5306,9 @@
         <w:jc w:val="center"/>
       </w:pPr>
       <w:r>
+        <w:rPr>
+          <w:noProof/>
+        </w:rPr>
         <w:drawing>
           <wp:inline distT="0" distB="0" distL="0" distR="0" wp14:anchorId="137A8DCD" wp14:editId="45EF25E5">
             <wp:extent cx="4936067" cy="3346083"/>
@@ -5344,11 +5358,21 @@
           <w:b/>
           <w:bCs/>
         </w:rPr>
-        <w:t>correlation map</w:t>
-      </w:r>
-    </w:p>
-    <w:p>
-      <w:r>
+        <w:t>correlation ma</w:t>
+      </w:r>
+      <w:r>
+        <w:rPr>
+          <w:b/>
+          <w:bCs/>
+        </w:rPr>
+        <w:t>trix</w:t>
+      </w:r>
+    </w:p>
+    <w:p>
+      <w:r>
+        <w:rPr>
+          <w:noProof/>
+        </w:rPr>
         <w:drawing>
           <wp:inline distT="0" distB="0" distL="0" distR="0" wp14:anchorId="3342D96F" wp14:editId="0CF176C2">
             <wp:extent cx="5943600" cy="3637915"/>
@@ -5691,13 +5715,7 @@
         </w:numPr>
       </w:pPr>
       <w:r>
-        <w:t>It's crucial to remember that a weak association equals a useless feature.</w:t>
-      </w:r>
-      <w:r>
-        <w:t xml:space="preserve"> </w:t>
-      </w:r>
-      <w:r>
-        <w:t xml:space="preserve">But for the initial iteration of my ML pipeline, I am maintaining </w:t>
+        <w:t xml:space="preserve">It's crucial to remember that a weak association equals a useless feature. But for the initial iteration of my ML pipeline, I am maintaining </w:t>
       </w:r>
       <w:proofErr w:type="gramStart"/>
       <w:r>
@@ -6022,11 +6040,17 @@
       </w:r>
     </w:p>
     <w:p>
-      <w:r>
+      <w:pPr>
+        <w:jc w:val="center"/>
+      </w:pPr>
+      <w:r>
+        <w:rPr>
+          <w:noProof/>
+        </w:rPr>
         <w:drawing>
-          <wp:inline distT="0" distB="0" distL="0" distR="0" wp14:anchorId="5C1C88BE" wp14:editId="4DB6C640">
-            <wp:extent cx="5128704" cy="3330229"/>
-            <wp:effectExtent l="0" t="0" r="0" b="3810"/>
+          <wp:inline distT="0" distB="0" distL="0" distR="0" wp14:anchorId="5C1C88BE" wp14:editId="3199D54E">
+            <wp:extent cx="3706091" cy="2406481"/>
+            <wp:effectExtent l="0" t="0" r="8890" b="0"/>
             <wp:docPr id="1882105415" name="Picture 1"/>
             <wp:cNvGraphicFramePr>
               <a:graphicFrameLocks xmlns:a="http://schemas.openxmlformats.org/drawingml/2006/main" noChangeAspect="1"/>
@@ -6047,7 +6071,7 @@
                   <pic:spPr>
                     <a:xfrm>
                       <a:off x="0" y="0"/>
-                      <a:ext cx="5128704" cy="3330229"/>
+                      <a:ext cx="3732539" cy="2423654"/>
                     </a:xfrm>
                     <a:prstGeom prst="rect">
                       <a:avLst/>
@@ -6060,6 +6084,128 @@
         </w:drawing>
       </w:r>
     </w:p>
+    <w:p>
+      <w:pPr>
+        <w:pStyle w:val="ListParagraph"/>
+        <w:numPr>
+          <w:ilvl w:val="0"/>
+          <w:numId w:val="40"/>
+        </w:numPr>
+      </w:pPr>
+      <w:r>
+        <w:t>85% of the predictions were correct</w:t>
+      </w:r>
+    </w:p>
+    <w:p>
+      <w:pPr>
+        <w:pStyle w:val="ListParagraph"/>
+        <w:numPr>
+          <w:ilvl w:val="0"/>
+          <w:numId w:val="40"/>
+        </w:numPr>
+      </w:pPr>
+      <w:r>
+        <w:t>89.6% of the times, the model has separated buyers from non-buyers</w:t>
+      </w:r>
+    </w:p>
+    <w:p>
+      <w:pPr>
+        <w:pStyle w:val="ListParagraph"/>
+        <w:numPr>
+          <w:ilvl w:val="0"/>
+          <w:numId w:val="40"/>
+        </w:numPr>
+      </w:pPr>
+      <w:r>
+        <w:t>This model has predicted “buyer</w:t>
+      </w:r>
+      <w:proofErr w:type="gramStart"/>
+      <w:r>
+        <w:t>”</w:t>
+      </w:r>
+      <w:proofErr w:type="gramEnd"/>
+      <w:r>
+        <w:t xml:space="preserve"> and it is correct 52% of the times and “non-buyers", 95%.</w:t>
+      </w:r>
+    </w:p>
+    <w:p>
+      <w:pPr>
+        <w:pStyle w:val="ListParagraph"/>
+        <w:numPr>
+          <w:ilvl w:val="0"/>
+          <w:numId w:val="40"/>
+        </w:numPr>
+      </w:pPr>
+      <w:r>
+        <w:t>The model successfully finds 75% of actual buyers.</w:t>
+      </w:r>
+    </w:p>
+    <w:p>
+      <w:pPr>
+        <w:pStyle w:val="ListParagraph"/>
+        <w:numPr>
+          <w:ilvl w:val="0"/>
+          <w:numId w:val="40"/>
+        </w:numPr>
+      </w:pPr>
+      <w:r>
+        <w:t>A reasonable F1-score</w:t>
+      </w:r>
+    </w:p>
+    <w:p>
+      <w:pPr>
+        <w:pStyle w:val="ListParagraph"/>
+        <w:numPr>
+          <w:ilvl w:val="0"/>
+          <w:numId w:val="40"/>
+        </w:numPr>
+      </w:pPr>
+      <w:r>
+        <w:t>True negatives – 1814</w:t>
+      </w:r>
+    </w:p>
+    <w:p>
+      <w:pPr>
+        <w:pStyle w:val="ListParagraph"/>
+        <w:numPr>
+          <w:ilvl w:val="0"/>
+          <w:numId w:val="40"/>
+        </w:numPr>
+      </w:pPr>
+      <w:r>
+        <w:t>False positives – 270</w:t>
+      </w:r>
+    </w:p>
+    <w:p>
+      <w:pPr>
+        <w:pStyle w:val="ListParagraph"/>
+        <w:numPr>
+          <w:ilvl w:val="0"/>
+          <w:numId w:val="40"/>
+        </w:numPr>
+      </w:pPr>
+      <w:r>
+        <w:t>False negatives – 95</w:t>
+      </w:r>
+    </w:p>
+    <w:p>
+      <w:pPr>
+        <w:pStyle w:val="ListParagraph"/>
+        <w:numPr>
+          <w:ilvl w:val="0"/>
+          <w:numId w:val="40"/>
+        </w:numPr>
+      </w:pPr>
+      <w:r>
+        <w:t xml:space="preserve">True positives </w:t>
+      </w:r>
+      <w:r>
+        <w:t>–</w:t>
+      </w:r>
+      <w:r>
+        <w:t xml:space="preserve"> 287</w:t>
+      </w:r>
+    </w:p>
     <w:p/>
     <w:p>
       <w:pPr>
@@ -6077,11 +6223,17 @@
       </w:r>
     </w:p>
     <w:p>
-      <w:r>
+      <w:pPr>
+        <w:jc w:val="center"/>
+      </w:pPr>
+      <w:r>
+        <w:rPr>
+          <w:noProof/>
+        </w:rPr>
         <w:drawing>
-          <wp:inline distT="0" distB="0" distL="0" distR="0" wp14:anchorId="15BEB2F1" wp14:editId="4FE39567">
-            <wp:extent cx="5151566" cy="3254022"/>
-            <wp:effectExtent l="0" t="0" r="0" b="3810"/>
+          <wp:inline distT="0" distB="0" distL="0" distR="0" wp14:anchorId="15BEB2F1" wp14:editId="54E0D42F">
+            <wp:extent cx="3865418" cy="2441618"/>
+            <wp:effectExtent l="0" t="0" r="1905" b="0"/>
             <wp:docPr id="1370971368" name="Picture 1"/>
             <wp:cNvGraphicFramePr>
               <a:graphicFrameLocks xmlns:a="http://schemas.openxmlformats.org/drawingml/2006/main" noChangeAspect="1"/>
@@ -6102,7 +6254,7 @@
                   <pic:spPr>
                     <a:xfrm>
                       <a:off x="0" y="0"/>
-                      <a:ext cx="5151566" cy="3254022"/>
+                      <a:ext cx="3877797" cy="2449437"/>
                     </a:xfrm>
                     <a:prstGeom prst="rect">
                       <a:avLst/>
@@ -6117,6 +6269,157 @@
     </w:p>
     <w:p>
       <w:pPr>
+        <w:pStyle w:val="ListParagraph"/>
+        <w:numPr>
+          <w:ilvl w:val="0"/>
+          <w:numId w:val="41"/>
+        </w:numPr>
+      </w:pPr>
+      <w:r>
+        <w:lastRenderedPageBreak/>
+        <w:t>8</w:t>
+      </w:r>
+      <w:r>
+        <w:t>8.6</w:t>
+      </w:r>
+      <w:r>
+        <w:t>% of the predictions were correct</w:t>
+      </w:r>
+    </w:p>
+    <w:p>
+      <w:pPr>
+        <w:pStyle w:val="ListParagraph"/>
+        <w:numPr>
+          <w:ilvl w:val="0"/>
+          <w:numId w:val="41"/>
+        </w:numPr>
+      </w:pPr>
+      <w:r>
+        <w:t>92</w:t>
+      </w:r>
+      <w:r>
+        <w:t>.6% of the times, the model has separated buyers from non-buyers</w:t>
+      </w:r>
+    </w:p>
+    <w:p>
+      <w:pPr>
+        <w:pStyle w:val="ListParagraph"/>
+        <w:numPr>
+          <w:ilvl w:val="0"/>
+          <w:numId w:val="41"/>
+        </w:numPr>
+      </w:pPr>
+      <w:r>
+        <w:t>This model has predicted “buyer</w:t>
+      </w:r>
+      <w:proofErr w:type="gramStart"/>
+      <w:r>
+        <w:t>”</w:t>
+      </w:r>
+      <w:proofErr w:type="gramEnd"/>
+      <w:r>
+        <w:t xml:space="preserve"> and it is correct </w:t>
+      </w:r>
+      <w:r>
+        <w:t>61</w:t>
+      </w:r>
+      <w:r>
+        <w:t>% of the times and “non-buyers", 95%.</w:t>
+      </w:r>
+    </w:p>
+    <w:p>
+      <w:pPr>
+        <w:pStyle w:val="ListParagraph"/>
+        <w:numPr>
+          <w:ilvl w:val="0"/>
+          <w:numId w:val="41"/>
+        </w:numPr>
+      </w:pPr>
+      <w:r>
+        <w:t>The model successfully finds 7</w:t>
+      </w:r>
+      <w:r>
+        <w:t>3</w:t>
+      </w:r>
+      <w:r>
+        <w:t>% of actual buyers.</w:t>
+      </w:r>
+    </w:p>
+    <w:p>
+      <w:pPr>
+        <w:pStyle w:val="ListParagraph"/>
+        <w:numPr>
+          <w:ilvl w:val="0"/>
+          <w:numId w:val="41"/>
+        </w:numPr>
+      </w:pPr>
+      <w:r>
+        <w:t>A reasonable F1-score</w:t>
+      </w:r>
+    </w:p>
+    <w:p>
+      <w:pPr>
+        <w:pStyle w:val="ListParagraph"/>
+        <w:numPr>
+          <w:ilvl w:val="0"/>
+          <w:numId w:val="41"/>
+        </w:numPr>
+      </w:pPr>
+      <w:r>
+        <w:t xml:space="preserve">True negatives – </w:t>
+      </w:r>
+      <w:r>
+        <w:t>1910</w:t>
+      </w:r>
+    </w:p>
+    <w:p>
+      <w:pPr>
+        <w:pStyle w:val="ListParagraph"/>
+        <w:numPr>
+          <w:ilvl w:val="0"/>
+          <w:numId w:val="41"/>
+        </w:numPr>
+      </w:pPr>
+      <w:r>
+        <w:t xml:space="preserve">False positives – </w:t>
+      </w:r>
+      <w:r>
+        <w:t>174</w:t>
+      </w:r>
+    </w:p>
+    <w:p>
+      <w:pPr>
+        <w:pStyle w:val="ListParagraph"/>
+        <w:numPr>
+          <w:ilvl w:val="0"/>
+          <w:numId w:val="41"/>
+        </w:numPr>
+      </w:pPr>
+      <w:r>
+        <w:t xml:space="preserve">False negatives – </w:t>
+      </w:r>
+      <w:r>
+        <w:t>105</w:t>
+      </w:r>
+    </w:p>
+    <w:p>
+      <w:pPr>
+        <w:pStyle w:val="ListParagraph"/>
+        <w:numPr>
+          <w:ilvl w:val="0"/>
+          <w:numId w:val="41"/>
+        </w:numPr>
+      </w:pPr>
+      <w:r>
+        <w:t xml:space="preserve">True positives - </w:t>
+      </w:r>
+      <w:r>
+        <w:t>277</w:t>
+      </w:r>
+    </w:p>
+    <w:p/>
+    <w:p>
+      <w:pPr>
         <w:rPr>
           <w:b/>
           <w:bCs/>
@@ -6127,15 +6430,20 @@
           <w:b/>
           <w:bCs/>
         </w:rPr>
-        <w:lastRenderedPageBreak/>
         <w:t>Tuned Random Forest:</w:t>
       </w:r>
     </w:p>
     <w:p>
-      <w:r>
+      <w:pPr>
+        <w:jc w:val="center"/>
+      </w:pPr>
+      <w:r>
+        <w:rPr>
+          <w:noProof/>
+        </w:rPr>
         <w:drawing>
-          <wp:inline distT="0" distB="0" distL="0" distR="0" wp14:anchorId="617E893C" wp14:editId="4E63A15B">
-            <wp:extent cx="5143946" cy="3276884"/>
+          <wp:inline distT="0" distB="0" distL="0" distR="0" wp14:anchorId="617E893C" wp14:editId="54BB7D7A">
+            <wp:extent cx="3871219" cy="2466109"/>
             <wp:effectExtent l="0" t="0" r="0" b="0"/>
             <wp:docPr id="744549259" name="Picture 1"/>
             <wp:cNvGraphicFramePr>
@@ -6157,7 +6465,7 @@
                   <pic:spPr>
                     <a:xfrm>
                       <a:off x="0" y="0"/>
-                      <a:ext cx="5143946" cy="3276884"/>
+                      <a:ext cx="3892984" cy="2479974"/>
                     </a:xfrm>
                     <a:prstGeom prst="rect">
                       <a:avLst/>
@@ -6170,13 +6478,158 @@
         </w:drawing>
       </w:r>
     </w:p>
+    <w:p>
+      <w:pPr>
+        <w:pStyle w:val="ListParagraph"/>
+        <w:numPr>
+          <w:ilvl w:val="0"/>
+          <w:numId w:val="42"/>
+        </w:numPr>
+      </w:pPr>
+      <w:r>
+        <w:t>8</w:t>
+      </w:r>
+      <w:r>
+        <w:t>7.3</w:t>
+      </w:r>
+      <w:r>
+        <w:t>% of the predictions were correct</w:t>
+      </w:r>
+    </w:p>
+    <w:p>
+      <w:pPr>
+        <w:pStyle w:val="ListParagraph"/>
+        <w:numPr>
+          <w:ilvl w:val="0"/>
+          <w:numId w:val="42"/>
+        </w:numPr>
+      </w:pPr>
+      <w:r>
+        <w:t>92</w:t>
+      </w:r>
+      <w:r>
+        <w:t>.</w:t>
+      </w:r>
+      <w:r>
+        <w:t>4</w:t>
+      </w:r>
+      <w:r>
+        <w:t>% of the times, the model has separated buyers from non-buyers</w:t>
+      </w:r>
+    </w:p>
+    <w:p>
+      <w:pPr>
+        <w:pStyle w:val="ListParagraph"/>
+        <w:numPr>
+          <w:ilvl w:val="0"/>
+          <w:numId w:val="42"/>
+        </w:numPr>
+      </w:pPr>
+      <w:r>
+        <w:t>This model has predicted “buyer</w:t>
+      </w:r>
+      <w:proofErr w:type="gramStart"/>
+      <w:r>
+        <w:t>”</w:t>
+      </w:r>
+      <w:proofErr w:type="gramEnd"/>
+      <w:r>
+        <w:t xml:space="preserve"> and it is correct 5</w:t>
+      </w:r>
+      <w:r>
+        <w:t>7</w:t>
+      </w:r>
+      <w:r>
+        <w:t>% of the times and “non-buyers", 95%.</w:t>
+      </w:r>
+    </w:p>
+    <w:p>
+      <w:pPr>
+        <w:pStyle w:val="ListParagraph"/>
+        <w:numPr>
+          <w:ilvl w:val="0"/>
+          <w:numId w:val="42"/>
+        </w:numPr>
+      </w:pPr>
+      <w:r>
+        <w:t>The model successfully finds 75% of actual buyers.</w:t>
+      </w:r>
+    </w:p>
+    <w:p>
+      <w:pPr>
+        <w:pStyle w:val="ListParagraph"/>
+        <w:numPr>
+          <w:ilvl w:val="0"/>
+          <w:numId w:val="42"/>
+        </w:numPr>
+      </w:pPr>
+      <w:r>
+        <w:t>A reasonable F1-score</w:t>
+      </w:r>
+    </w:p>
+    <w:p>
+      <w:pPr>
+        <w:pStyle w:val="ListParagraph"/>
+        <w:numPr>
+          <w:ilvl w:val="0"/>
+          <w:numId w:val="42"/>
+        </w:numPr>
+      </w:pPr>
+      <w:r>
+        <w:t>True negatives – 18</w:t>
+      </w:r>
+      <w:r>
+        <w:t>67</w:t>
+      </w:r>
+    </w:p>
+    <w:p>
+      <w:pPr>
+        <w:pStyle w:val="ListParagraph"/>
+        <w:numPr>
+          <w:ilvl w:val="0"/>
+          <w:numId w:val="42"/>
+        </w:numPr>
+      </w:pPr>
+      <w:r>
+        <w:t>False positives – 2</w:t>
+      </w:r>
+      <w:r>
+        <w:t>17</w:t>
+      </w:r>
+    </w:p>
+    <w:p>
+      <w:pPr>
+        <w:pStyle w:val="ListParagraph"/>
+        <w:numPr>
+          <w:ilvl w:val="0"/>
+          <w:numId w:val="42"/>
+        </w:numPr>
+      </w:pPr>
+      <w:r>
+        <w:t>False negatives – 95</w:t>
+      </w:r>
+    </w:p>
+    <w:p>
+      <w:pPr>
+        <w:pStyle w:val="ListParagraph"/>
+        <w:numPr>
+          <w:ilvl w:val="0"/>
+          <w:numId w:val="42"/>
+        </w:numPr>
+      </w:pPr>
+      <w:r>
+        <w:t>True positives - 287</w:t>
+      </w:r>
+    </w:p>
     <w:p/>
+    <w:p/>
     <w:p>
       <w:pPr>
         <w:pStyle w:val="Heading1"/>
       </w:pPr>
       <w:bookmarkStart w:id="17" w:name="_Toc229176890"/>
       <w:r>
+        <w:lastRenderedPageBreak/>
         <w:t>8. Hyperparameter Tuning</w:t>
       </w:r>
       <w:bookmarkEnd w:id="17"/>
@@ -6325,14 +6778,12 @@
         <w:t xml:space="preserve"> – Minimum samples required at a leaf node </w:t>
       </w:r>
     </w:p>
-    <w:p/>
     <w:p>
       <w:pPr>
         <w:pStyle w:val="Heading3"/>
       </w:pPr>
       <w:bookmarkStart w:id="20" w:name="_Toc229176893"/>
       <w:r>
-        <w:lastRenderedPageBreak/>
         <w:t>Benefits of Hyperparameter Tuning</w:t>
       </w:r>
       <w:bookmarkEnd w:id="20"/>
@@ -6342,13 +6793,7 @@
         <w:t xml:space="preserve">Hyperparameter tuning improves model performance by identifying the most effective parameter configuration for the dataset. </w:t>
       </w:r>
       <w:r>
-        <w:t>This procedure enhances generalisation, lowers overfitting, and raises prediction accuracy.</w:t>
-      </w:r>
-      <w:r>
-        <w:t xml:space="preserve"> </w:t>
-      </w:r>
-      <w:r>
-        <w:t>The final model for segmentation and prediction tasks was the tweaked Random Forest model, which outperformed the baseline models.</w:t>
+        <w:t>This procedure enhances generalisation, lowers overfitting, and raises prediction accuracy. The final model for segmentation and prediction tasks was the tweaked Random Forest model, which outperformed the baseline models.</w:t>
       </w:r>
     </w:p>
     <w:p/>
@@ -6443,6 +6888,7 @@
     </w:p>
     <w:p>
       <w:r>
+        <w:lastRenderedPageBreak/>
         <w:t>The preprocessing module is designed to support both training data and newly uploaded datasets during inference.</w:t>
       </w:r>
     </w:p>
@@ -6550,7 +6996,6 @@
       </w:pPr>
       <w:bookmarkStart w:id="26" w:name="_Toc229176899"/>
       <w:r>
-        <w:lastRenderedPageBreak/>
         <w:t>Key Features</w:t>
       </w:r>
       <w:bookmarkEnd w:id="26"/>
@@ -6704,6 +7149,7 @@
       </w:pPr>
       <w:bookmarkStart w:id="30" w:name="_Toc229176903"/>
       <w:r>
+        <w:lastRenderedPageBreak/>
         <w:t xml:space="preserve">10. </w:t>
       </w:r>
       <w:proofErr w:type="spellStart"/>
@@ -6858,7 +7304,6 @@
           <w:b/>
           <w:bCs/>
         </w:rPr>
-        <w:lastRenderedPageBreak/>
         <w:t>Low Intent Visitor</w:t>
       </w:r>
     </w:p>
@@ -6947,19 +7392,15 @@
         <w:t>This makes the project more practical for real-world e-commerce analytics.</w:t>
       </w:r>
     </w:p>
-    <w:p>
-      <w:r>
-        <w:pict w14:anchorId="2BE88B9F">
-          <v:rect id="_x0000_i1145" style="width:0;height:1.5pt" o:hralign="center" o:hrstd="t" o:hr="t" fillcolor="#a0a0a0" stroked="f"/>
-        </w:pict>
-      </w:r>
-    </w:p>
+    <w:p/>
+    <w:p/>
     <w:p>
       <w:pPr>
         <w:pStyle w:val="Heading1"/>
       </w:pPr>
       <w:bookmarkStart w:id="33" w:name="_Toc229176906"/>
       <w:r>
+        <w:lastRenderedPageBreak/>
         <w:t>11. Dashboard</w:t>
       </w:r>
       <w:bookmarkEnd w:id="33"/>
@@ -7284,33 +7725,105 @@
           <w:i/>
           <w:iCs/>
         </w:rPr>
+        <w:t>Real-Time Predictions</w:t>
+      </w:r>
+    </w:p>
+    <w:p>
+      <w:pPr>
+        <w:pStyle w:val="ListParagraph"/>
+      </w:pPr>
+      <w:r>
+        <w:t xml:space="preserve">Uploaded datasets are processed through the trained machine learning pipeline to generate live predictions and </w:t>
+      </w:r>
+      <w:proofErr w:type="spellStart"/>
+      <w:r>
+        <w:t>behavioral</w:t>
+      </w:r>
+      <w:proofErr w:type="spellEnd"/>
+      <w:r>
+        <w:t xml:space="preserve"> segmentation.</w:t>
+      </w:r>
+    </w:p>
+    <w:p/>
+    <w:p>
+      <w:r>
+        <w:t xml:space="preserve">I’ve experimented with few </w:t>
+      </w:r>
+      <w:proofErr w:type="spellStart"/>
+      <w:r>
+        <w:t>Dasboard</w:t>
+      </w:r>
+      <w:proofErr w:type="spellEnd"/>
+      <w:r>
+        <w:t xml:space="preserve"> types</w:t>
+      </w:r>
+    </w:p>
+    <w:p>
+      <w:pPr>
+        <w:pStyle w:val="ListParagraph"/>
+        <w:numPr>
+          <w:ilvl w:val="0"/>
+          <w:numId w:val="43"/>
+        </w:numPr>
+      </w:pPr>
+      <w:r>
+        <w:t xml:space="preserve">Created a Dashboard with </w:t>
+      </w:r>
+      <w:proofErr w:type="spellStart"/>
+      <w:r>
+        <w:t>Streamlit</w:t>
+      </w:r>
+      <w:proofErr w:type="spellEnd"/>
+      <w:r>
+        <w:t xml:space="preserve"> – difficulty level easy</w:t>
+      </w:r>
+    </w:p>
+    <w:p>
+      <w:pPr>
+        <w:pStyle w:val="ListParagraph"/>
+        <w:numPr>
+          <w:ilvl w:val="0"/>
+          <w:numId w:val="43"/>
+        </w:numPr>
+      </w:pPr>
+      <w:r>
+        <w:t>Created a Dashboard with Dash by Plotly -Dash is like building a web page with Python</w:t>
+      </w:r>
+    </w:p>
+    <w:p>
+      <w:pPr>
+        <w:pStyle w:val="ListParagraph"/>
+        <w:numPr>
+          <w:ilvl w:val="0"/>
+          <w:numId w:val="43"/>
+        </w:numPr>
+      </w:pPr>
+      <w:r>
+        <w:t>Created a Dashboard with Flask + HTML/CSS – This is like a web project</w:t>
+      </w:r>
+    </w:p>
+    <w:p>
+      <w:pPr>
+        <w:pStyle w:val="ListParagraph"/>
+        <w:numPr>
+          <w:ilvl w:val="0"/>
+          <w:numId w:val="43"/>
+        </w:numPr>
+      </w:pPr>
+      <w:r>
+        <w:t>Finally developed the Dash dashboard to handle CSV upload</w:t>
+      </w:r>
+    </w:p>
+    <w:p/>
+    <w:p/>
+    <w:p/>
+    <w:p>
+      <w:pPr>
+        <w:pStyle w:val="Heading1"/>
+      </w:pPr>
+      <w:bookmarkStart w:id="34" w:name="_Toc229176907"/>
+      <w:r>
         <w:lastRenderedPageBreak/>
-        <w:t>Real-Time Predictions</w:t>
-      </w:r>
-    </w:p>
-    <w:p>
-      <w:pPr>
-        <w:pStyle w:val="ListParagraph"/>
-      </w:pPr>
-      <w:r>
-        <w:t xml:space="preserve">Uploaded datasets are processed through the trained machine learning pipeline to generate live predictions and </w:t>
-      </w:r>
-      <w:proofErr w:type="spellStart"/>
-      <w:r>
-        <w:t>behavioral</w:t>
-      </w:r>
-      <w:proofErr w:type="spellEnd"/>
-      <w:r>
-        <w:t xml:space="preserve"> segmentation.</w:t>
-      </w:r>
-    </w:p>
-    <w:p/>
-    <w:p>
-      <w:pPr>
-        <w:pStyle w:val="Heading1"/>
-      </w:pPr>
-      <w:bookmarkStart w:id="34" w:name="_Toc229176907"/>
-      <w:r>
         <w:t>12. System Workflow</w:t>
       </w:r>
       <w:bookmarkEnd w:id="34"/>
@@ -7528,12 +8041,14 @@
       </w:pPr>
     </w:p>
     <w:p/>
+    <w:p/>
     <w:p>
       <w:pPr>
         <w:pStyle w:val="Heading1"/>
       </w:pPr>
       <w:bookmarkStart w:id="36" w:name="_Toc229176909"/>
       <w:r>
+        <w:lastRenderedPageBreak/>
         <w:t>14. Limitations</w:t>
       </w:r>
       <w:bookmarkEnd w:id="36"/>
@@ -7695,12 +8210,17 @@
       </w:r>
     </w:p>
     <w:p/>
+    <w:p/>
+    <w:p/>
+    <w:p/>
+    <w:p/>
     <w:p>
       <w:pPr>
         <w:pStyle w:val="Heading1"/>
       </w:pPr>
       <w:bookmarkStart w:id="42" w:name="_Toc229176915"/>
       <w:r>
+        <w:lastRenderedPageBreak/>
         <w:t>16. How to Run the Project</w:t>
       </w:r>
       <w:bookmarkEnd w:id="42"/>
@@ -7727,7 +8247,6 @@
     </w:p>
     <w:p>
       <w:r>
-        <w:lastRenderedPageBreak/>
         <w:t>pip install -r requirements.txt</w:t>
       </w:r>
     </w:p>
@@ -7745,10 +8264,74 @@
       <w:r>
         <w:t>Step 4 – Launch Dashboard</w:t>
       </w:r>
+      <w:r>
+        <w:t xml:space="preserve"> made with </w:t>
+      </w:r>
+      <w:proofErr w:type="spellStart"/>
+      <w:r>
+        <w:t>Streamlit</w:t>
+      </w:r>
+      <w:proofErr w:type="spellEnd"/>
+    </w:p>
+    <w:p>
+      <w:proofErr w:type="spellStart"/>
+      <w:r>
+        <w:t>streamlit</w:t>
+      </w:r>
+      <w:proofErr w:type="spellEnd"/>
+      <w:r>
+        <w:t xml:space="preserve"> run app/dashboard.py</w:t>
+      </w:r>
+    </w:p>
+    <w:p>
+      <w:r>
+        <w:t>Step 5 – Lauch Dashboard made with Dash by Plotly</w:t>
+      </w:r>
     </w:p>
     <w:p>
       <w:r>
         <w:t>python app/dashboard_dash.py</w:t>
+      </w:r>
+    </w:p>
+    <w:p>
+      <w:r>
+        <w:t xml:space="preserve">Step </w:t>
+      </w:r>
+      <w:r>
+        <w:t>6</w:t>
+      </w:r>
+      <w:r>
+        <w:t xml:space="preserve"> – Lauch Dashboard made with </w:t>
+      </w:r>
+      <w:r>
+        <w:t>Flask + HTML/CSS</w:t>
+      </w:r>
+    </w:p>
+    <w:p>
+      <w:r>
+        <w:t>python app/</w:t>
+      </w:r>
+      <w:r>
+        <w:t>app</w:t>
+      </w:r>
+      <w:r>
+        <w:t>.py</w:t>
+      </w:r>
+    </w:p>
+    <w:p>
+      <w:r>
+        <w:t>Step 7 – Launch Dashboard made with Dash to upload CSV files</w:t>
+      </w:r>
+    </w:p>
+    <w:p>
+      <w:r>
+        <w:t>python app/</w:t>
+      </w:r>
+      <w:r>
+        <w:t>dashboard_dash_with_upload</w:t>
+      </w:r>
+      <w:r>
+        <w:t>.py</w:t>
       </w:r>
     </w:p>
     <w:p/>
@@ -7864,8 +8447,10 @@
         <w:t xml:space="preserve"> insights that can support marketing optimization, customer targeting, and personalization strategies in e-commerce environments.</w:t>
       </w:r>
     </w:p>
-    <w:p>
-      <w:r>
+    <w:p/>
+    <w:p>
+      <w:r>
+        <w:lastRenderedPageBreak/>
         <w:t>Technically, the project demonstrates skills in:</w:t>
       </w:r>
     </w:p>
@@ -7948,6 +8533,7 @@
         <w:t xml:space="preserve"> analytics and machine learning can be integrated to support data-driven decision-making in modern e-commerce systems.</w:t>
       </w:r>
     </w:p>
+    <w:p/>
     <w:p/>
     <w:sectPr>
       <w:pgSz w:w="12240" w:h="15840"/>
@@ -9319,6 +9905,119 @@
     </w:lvl>
   </w:abstractNum>
   <w:abstractNum w:abstractNumId="9" w15:restartNumberingAfterBreak="0">
+    <w:nsid w:val="15B327F8"/>
+    <w:multiLevelType w:val="hybridMultilevel"/>
+    <w:tmpl w:val="2AF096E6"/>
+    <w:lvl w:ilvl="0" w:tplc="08090001">
+      <w:start w:val="1"/>
+      <w:numFmt w:val="bullet"/>
+      <w:lvlText w:val=""/>
+      <w:lvlJc w:val="left"/>
+      <w:pPr>
+        <w:ind w:left="720" w:hanging="360"/>
+      </w:pPr>
+      <w:rPr>
+        <w:rFonts w:ascii="Symbol" w:hAnsi="Symbol" w:hint="default"/>
+      </w:rPr>
+    </w:lvl>
+    <w:lvl w:ilvl="1" w:tplc="08090003" w:tentative="1">
+      <w:start w:val="1"/>
+      <w:numFmt w:val="bullet"/>
+      <w:lvlText w:val="o"/>
+      <w:lvlJc w:val="left"/>
+      <w:pPr>
+        <w:ind w:left="1440" w:hanging="360"/>
+      </w:pPr>
+      <w:rPr>
+        <w:rFonts w:ascii="Courier New" w:hAnsi="Courier New" w:cs="Courier New" w:hint="default"/>
+      </w:rPr>
+    </w:lvl>
+    <w:lvl w:ilvl="2" w:tplc="08090005" w:tentative="1">
+      <w:start w:val="1"/>
+      <w:numFmt w:val="bullet"/>
+      <w:lvlText w:val=""/>
+      <w:lvlJc w:val="left"/>
+      <w:pPr>
+        <w:ind w:left="2160" w:hanging="360"/>
+      </w:pPr>
+      <w:rPr>
+        <w:rFonts w:ascii="Wingdings" w:hAnsi="Wingdings" w:hint="default"/>
+      </w:rPr>
+    </w:lvl>
+    <w:lvl w:ilvl="3" w:tplc="08090001" w:tentative="1">
+      <w:start w:val="1"/>
+      <w:numFmt w:val="bullet"/>
+      <w:lvlText w:val=""/>
+      <w:lvlJc w:val="left"/>
+      <w:pPr>
+        <w:ind w:left="2880" w:hanging="360"/>
+      </w:pPr>
+      <w:rPr>
+        <w:rFonts w:ascii="Symbol" w:hAnsi="Symbol" w:hint="default"/>
+      </w:rPr>
+    </w:lvl>
+    <w:lvl w:ilvl="4" w:tplc="08090003" w:tentative="1">
+      <w:start w:val="1"/>
+      <w:numFmt w:val="bullet"/>
+      <w:lvlText w:val="o"/>
+      <w:lvlJc w:val="left"/>
+      <w:pPr>
+        <w:ind w:left="3600" w:hanging="360"/>
+      </w:pPr>
+      <w:rPr>
+        <w:rFonts w:ascii="Courier New" w:hAnsi="Courier New" w:cs="Courier New" w:hint="default"/>
+      </w:rPr>
+    </w:lvl>
+    <w:lvl w:ilvl="5" w:tplc="08090005" w:tentative="1">
+      <w:start w:val="1"/>
+      <w:numFmt w:val="bullet"/>
+      <w:lvlText w:val=""/>
+      <w:lvlJc w:val="left"/>
+      <w:pPr>
+        <w:ind w:left="4320" w:hanging="360"/>
+      </w:pPr>
+      <w:rPr>
+        <w:rFonts w:ascii="Wingdings" w:hAnsi="Wingdings" w:hint="default"/>
+      </w:rPr>
+    </w:lvl>
+    <w:lvl w:ilvl="6" w:tplc="08090001" w:tentative="1">
+      <w:start w:val="1"/>
+      <w:numFmt w:val="bullet"/>
+      <w:lvlText w:val=""/>
+      <w:lvlJc w:val="left"/>
+      <w:pPr>
+        <w:ind w:left="5040" w:hanging="360"/>
+      </w:pPr>
+      <w:rPr>
+        <w:rFonts w:ascii="Symbol" w:hAnsi="Symbol" w:hint="default"/>
+      </w:rPr>
+    </w:lvl>
+    <w:lvl w:ilvl="7" w:tplc="08090003" w:tentative="1">
+      <w:start w:val="1"/>
+      <w:numFmt w:val="bullet"/>
+      <w:lvlText w:val="o"/>
+      <w:lvlJc w:val="left"/>
+      <w:pPr>
+        <w:ind w:left="5760" w:hanging="360"/>
+      </w:pPr>
+      <w:rPr>
+        <w:rFonts w:ascii="Courier New" w:hAnsi="Courier New" w:cs="Courier New" w:hint="default"/>
+      </w:rPr>
+    </w:lvl>
+    <w:lvl w:ilvl="8" w:tplc="08090005" w:tentative="1">
+      <w:start w:val="1"/>
+      <w:numFmt w:val="bullet"/>
+      <w:lvlText w:val=""/>
+      <w:lvlJc w:val="left"/>
+      <w:pPr>
+        <w:ind w:left="6480" w:hanging="360"/>
+      </w:pPr>
+      <w:rPr>
+        <w:rFonts w:ascii="Wingdings" w:hAnsi="Wingdings" w:hint="default"/>
+      </w:rPr>
+    </w:lvl>
+  </w:abstractNum>
+  <w:abstractNum w:abstractNumId="10" w15:restartNumberingAfterBreak="0">
     <w:nsid w:val="167530FB"/>
     <w:multiLevelType w:val="multilevel"/>
     <w:tmpl w:val="81E25E30"/>
@@ -9467,7 +10166,120 @@
       </w:rPr>
     </w:lvl>
   </w:abstractNum>
-  <w:abstractNum w:abstractNumId="10" w15:restartNumberingAfterBreak="0">
+  <w:abstractNum w:abstractNumId="11" w15:restartNumberingAfterBreak="0">
+    <w:nsid w:val="183C632C"/>
+    <w:multiLevelType w:val="hybridMultilevel"/>
+    <w:tmpl w:val="D1C2BD14"/>
+    <w:lvl w:ilvl="0" w:tplc="08090001">
+      <w:start w:val="1"/>
+      <w:numFmt w:val="bullet"/>
+      <w:lvlText w:val=""/>
+      <w:lvlJc w:val="left"/>
+      <w:pPr>
+        <w:ind w:left="720" w:hanging="360"/>
+      </w:pPr>
+      <w:rPr>
+        <w:rFonts w:ascii="Symbol" w:hAnsi="Symbol" w:hint="default"/>
+      </w:rPr>
+    </w:lvl>
+    <w:lvl w:ilvl="1" w:tplc="08090003" w:tentative="1">
+      <w:start w:val="1"/>
+      <w:numFmt w:val="bullet"/>
+      <w:lvlText w:val="o"/>
+      <w:lvlJc w:val="left"/>
+      <w:pPr>
+        <w:ind w:left="1440" w:hanging="360"/>
+      </w:pPr>
+      <w:rPr>
+        <w:rFonts w:ascii="Courier New" w:hAnsi="Courier New" w:cs="Courier New" w:hint="default"/>
+      </w:rPr>
+    </w:lvl>
+    <w:lvl w:ilvl="2" w:tplc="08090005" w:tentative="1">
+      <w:start w:val="1"/>
+      <w:numFmt w:val="bullet"/>
+      <w:lvlText w:val=""/>
+      <w:lvlJc w:val="left"/>
+      <w:pPr>
+        <w:ind w:left="2160" w:hanging="360"/>
+      </w:pPr>
+      <w:rPr>
+        <w:rFonts w:ascii="Wingdings" w:hAnsi="Wingdings" w:hint="default"/>
+      </w:rPr>
+    </w:lvl>
+    <w:lvl w:ilvl="3" w:tplc="08090001" w:tentative="1">
+      <w:start w:val="1"/>
+      <w:numFmt w:val="bullet"/>
+      <w:lvlText w:val=""/>
+      <w:lvlJc w:val="left"/>
+      <w:pPr>
+        <w:ind w:left="2880" w:hanging="360"/>
+      </w:pPr>
+      <w:rPr>
+        <w:rFonts w:ascii="Symbol" w:hAnsi="Symbol" w:hint="default"/>
+      </w:rPr>
+    </w:lvl>
+    <w:lvl w:ilvl="4" w:tplc="08090003" w:tentative="1">
+      <w:start w:val="1"/>
+      <w:numFmt w:val="bullet"/>
+      <w:lvlText w:val="o"/>
+      <w:lvlJc w:val="left"/>
+      <w:pPr>
+        <w:ind w:left="3600" w:hanging="360"/>
+      </w:pPr>
+      <w:rPr>
+        <w:rFonts w:ascii="Courier New" w:hAnsi="Courier New" w:cs="Courier New" w:hint="default"/>
+      </w:rPr>
+    </w:lvl>
+    <w:lvl w:ilvl="5" w:tplc="08090005" w:tentative="1">
+      <w:start w:val="1"/>
+      <w:numFmt w:val="bullet"/>
+      <w:lvlText w:val=""/>
+      <w:lvlJc w:val="left"/>
+      <w:pPr>
+        <w:ind w:left="4320" w:hanging="360"/>
+      </w:pPr>
+      <w:rPr>
+        <w:rFonts w:ascii="Wingdings" w:hAnsi="Wingdings" w:hint="default"/>
+      </w:rPr>
+    </w:lvl>
+    <w:lvl w:ilvl="6" w:tplc="08090001" w:tentative="1">
+      <w:start w:val="1"/>
+      <w:numFmt w:val="bullet"/>
+      <w:lvlText w:val=""/>
+      <w:lvlJc w:val="left"/>
+      <w:pPr>
+        <w:ind w:left="5040" w:hanging="360"/>
+      </w:pPr>
+      <w:rPr>
+        <w:rFonts w:ascii="Symbol" w:hAnsi="Symbol" w:hint="default"/>
+      </w:rPr>
+    </w:lvl>
+    <w:lvl w:ilvl="7" w:tplc="08090003" w:tentative="1">
+      <w:start w:val="1"/>
+      <w:numFmt w:val="bullet"/>
+      <w:lvlText w:val="o"/>
+      <w:lvlJc w:val="left"/>
+      <w:pPr>
+        <w:ind w:left="5760" w:hanging="360"/>
+      </w:pPr>
+      <w:rPr>
+        <w:rFonts w:ascii="Courier New" w:hAnsi="Courier New" w:cs="Courier New" w:hint="default"/>
+      </w:rPr>
+    </w:lvl>
+    <w:lvl w:ilvl="8" w:tplc="08090005" w:tentative="1">
+      <w:start w:val="1"/>
+      <w:numFmt w:val="bullet"/>
+      <w:lvlText w:val=""/>
+      <w:lvlJc w:val="left"/>
+      <w:pPr>
+        <w:ind w:left="6480" w:hanging="360"/>
+      </w:pPr>
+      <w:rPr>
+        <w:rFonts w:ascii="Wingdings" w:hAnsi="Wingdings" w:hint="default"/>
+      </w:rPr>
+    </w:lvl>
+  </w:abstractNum>
+  <w:abstractNum w:abstractNumId="12" w15:restartNumberingAfterBreak="0">
     <w:nsid w:val="1EFA0F0C"/>
     <w:multiLevelType w:val="multilevel"/>
     <w:tmpl w:val="BF280E8C"/>
@@ -9616,7 +10428,7 @@
       </w:rPr>
     </w:lvl>
   </w:abstractNum>
-  <w:abstractNum w:abstractNumId="11" w15:restartNumberingAfterBreak="0">
+  <w:abstractNum w:abstractNumId="13" w15:restartNumberingAfterBreak="0">
     <w:nsid w:val="278A16D3"/>
     <w:multiLevelType w:val="multilevel"/>
     <w:tmpl w:val="A75AD8C0"/>
@@ -9765,7 +10577,7 @@
       </w:rPr>
     </w:lvl>
   </w:abstractNum>
-  <w:abstractNum w:abstractNumId="12" w15:restartNumberingAfterBreak="0">
+  <w:abstractNum w:abstractNumId="14" w15:restartNumberingAfterBreak="0">
     <w:nsid w:val="316E7FC2"/>
     <w:multiLevelType w:val="multilevel"/>
     <w:tmpl w:val="2DDEE320"/>
@@ -9914,7 +10726,7 @@
       </w:rPr>
     </w:lvl>
   </w:abstractNum>
-  <w:abstractNum w:abstractNumId="13" w15:restartNumberingAfterBreak="0">
+  <w:abstractNum w:abstractNumId="15" w15:restartNumberingAfterBreak="0">
     <w:nsid w:val="321D2E07"/>
     <w:multiLevelType w:val="hybridMultilevel"/>
     <w:tmpl w:val="F27C1750"/>
@@ -10027,7 +10839,7 @@
       </w:rPr>
     </w:lvl>
   </w:abstractNum>
-  <w:abstractNum w:abstractNumId="14" w15:restartNumberingAfterBreak="0">
+  <w:abstractNum w:abstractNumId="16" w15:restartNumberingAfterBreak="0">
     <w:nsid w:val="361F7D3C"/>
     <w:multiLevelType w:val="multilevel"/>
     <w:tmpl w:val="91201E24"/>
@@ -10176,7 +10988,7 @@
       </w:rPr>
     </w:lvl>
   </w:abstractNum>
-  <w:abstractNum w:abstractNumId="15" w15:restartNumberingAfterBreak="0">
+  <w:abstractNum w:abstractNumId="17" w15:restartNumberingAfterBreak="0">
     <w:nsid w:val="381542C7"/>
     <w:multiLevelType w:val="hybridMultilevel"/>
     <w:tmpl w:val="0756CD88"/>
@@ -10289,7 +11101,7 @@
       </w:rPr>
     </w:lvl>
   </w:abstractNum>
-  <w:abstractNum w:abstractNumId="16" w15:restartNumberingAfterBreak="0">
+  <w:abstractNum w:abstractNumId="18" w15:restartNumberingAfterBreak="0">
     <w:nsid w:val="393E4595"/>
     <w:multiLevelType w:val="multilevel"/>
     <w:tmpl w:val="4C6AD6A0"/>
@@ -10438,7 +11250,7 @@
       </w:rPr>
     </w:lvl>
   </w:abstractNum>
-  <w:abstractNum w:abstractNumId="17" w15:restartNumberingAfterBreak="0">
+  <w:abstractNum w:abstractNumId="19" w15:restartNumberingAfterBreak="0">
     <w:nsid w:val="39C031C6"/>
     <w:multiLevelType w:val="multilevel"/>
     <w:tmpl w:val="717E5CF8"/>
@@ -10587,7 +11399,7 @@
       </w:rPr>
     </w:lvl>
   </w:abstractNum>
-  <w:abstractNum w:abstractNumId="18" w15:restartNumberingAfterBreak="0">
+  <w:abstractNum w:abstractNumId="20" w15:restartNumberingAfterBreak="0">
     <w:nsid w:val="39FE0DAA"/>
     <w:multiLevelType w:val="multilevel"/>
     <w:tmpl w:val="DA5CAA40"/>
@@ -10736,7 +11548,7 @@
       </w:rPr>
     </w:lvl>
   </w:abstractNum>
-  <w:abstractNum w:abstractNumId="19" w15:restartNumberingAfterBreak="0">
+  <w:abstractNum w:abstractNumId="21" w15:restartNumberingAfterBreak="0">
     <w:nsid w:val="3A79727C"/>
     <w:multiLevelType w:val="multilevel"/>
     <w:tmpl w:val="884666DC"/>
@@ -10885,7 +11697,7 @@
       </w:rPr>
     </w:lvl>
   </w:abstractNum>
-  <w:abstractNum w:abstractNumId="20" w15:restartNumberingAfterBreak="0">
+  <w:abstractNum w:abstractNumId="22" w15:restartNumberingAfterBreak="0">
     <w:nsid w:val="3AB860CF"/>
     <w:multiLevelType w:val="multilevel"/>
     <w:tmpl w:val="55B22092"/>
@@ -11034,7 +11846,7 @@
       </w:rPr>
     </w:lvl>
   </w:abstractNum>
-  <w:abstractNum w:abstractNumId="21" w15:restartNumberingAfterBreak="0">
+  <w:abstractNum w:abstractNumId="23" w15:restartNumberingAfterBreak="0">
     <w:nsid w:val="3BBC496A"/>
     <w:multiLevelType w:val="multilevel"/>
     <w:tmpl w:val="6DC4887C"/>
@@ -11183,7 +11995,7 @@
       </w:rPr>
     </w:lvl>
   </w:abstractNum>
-  <w:abstractNum w:abstractNumId="22" w15:restartNumberingAfterBreak="0">
+  <w:abstractNum w:abstractNumId="24" w15:restartNumberingAfterBreak="0">
     <w:nsid w:val="3C513ABA"/>
     <w:multiLevelType w:val="multilevel"/>
     <w:tmpl w:val="83085F0C"/>
@@ -11332,7 +12144,7 @@
       </w:rPr>
     </w:lvl>
   </w:abstractNum>
-  <w:abstractNum w:abstractNumId="23" w15:restartNumberingAfterBreak="0">
+  <w:abstractNum w:abstractNumId="25" w15:restartNumberingAfterBreak="0">
     <w:nsid w:val="3E255A5A"/>
     <w:multiLevelType w:val="multilevel"/>
     <w:tmpl w:val="F96E7484"/>
@@ -11481,7 +12293,7 @@
       </w:rPr>
     </w:lvl>
   </w:abstractNum>
-  <w:abstractNum w:abstractNumId="24" w15:restartNumberingAfterBreak="0">
+  <w:abstractNum w:abstractNumId="26" w15:restartNumberingAfterBreak="0">
     <w:nsid w:val="41B2173D"/>
     <w:multiLevelType w:val="multilevel"/>
     <w:tmpl w:val="733EA1DA"/>
@@ -11630,7 +12442,7 @@
       </w:rPr>
     </w:lvl>
   </w:abstractNum>
-  <w:abstractNum w:abstractNumId="25" w15:restartNumberingAfterBreak="0">
+  <w:abstractNum w:abstractNumId="27" w15:restartNumberingAfterBreak="0">
     <w:nsid w:val="4A6714C3"/>
     <w:multiLevelType w:val="multilevel"/>
     <w:tmpl w:val="839C6444"/>
@@ -11779,7 +12591,7 @@
       </w:rPr>
     </w:lvl>
   </w:abstractNum>
-  <w:abstractNum w:abstractNumId="26" w15:restartNumberingAfterBreak="0">
+  <w:abstractNum w:abstractNumId="28" w15:restartNumberingAfterBreak="0">
     <w:nsid w:val="53996398"/>
     <w:multiLevelType w:val="multilevel"/>
     <w:tmpl w:val="28FEF560"/>
@@ -11928,7 +12740,7 @@
       </w:rPr>
     </w:lvl>
   </w:abstractNum>
-  <w:abstractNum w:abstractNumId="27" w15:restartNumberingAfterBreak="0">
+  <w:abstractNum w:abstractNumId="29" w15:restartNumberingAfterBreak="0">
     <w:nsid w:val="54505B87"/>
     <w:multiLevelType w:val="multilevel"/>
     <w:tmpl w:val="1AD80F6E"/>
@@ -12077,7 +12889,120 @@
       </w:rPr>
     </w:lvl>
   </w:abstractNum>
-  <w:abstractNum w:abstractNumId="28" w15:restartNumberingAfterBreak="0">
+  <w:abstractNum w:abstractNumId="30" w15:restartNumberingAfterBreak="0">
+    <w:nsid w:val="557E04A2"/>
+    <w:multiLevelType w:val="hybridMultilevel"/>
+    <w:tmpl w:val="C84CA800"/>
+    <w:lvl w:ilvl="0" w:tplc="08090001">
+      <w:start w:val="1"/>
+      <w:numFmt w:val="bullet"/>
+      <w:lvlText w:val=""/>
+      <w:lvlJc w:val="left"/>
+      <w:pPr>
+        <w:ind w:left="720" w:hanging="360"/>
+      </w:pPr>
+      <w:rPr>
+        <w:rFonts w:ascii="Symbol" w:hAnsi="Symbol" w:hint="default"/>
+      </w:rPr>
+    </w:lvl>
+    <w:lvl w:ilvl="1" w:tplc="08090003" w:tentative="1">
+      <w:start w:val="1"/>
+      <w:numFmt w:val="bullet"/>
+      <w:lvlText w:val="o"/>
+      <w:lvlJc w:val="left"/>
+      <w:pPr>
+        <w:ind w:left="1440" w:hanging="360"/>
+      </w:pPr>
+      <w:rPr>
+        <w:rFonts w:ascii="Courier New" w:hAnsi="Courier New" w:cs="Courier New" w:hint="default"/>
+      </w:rPr>
+    </w:lvl>
+    <w:lvl w:ilvl="2" w:tplc="08090005" w:tentative="1">
+      <w:start w:val="1"/>
+      <w:numFmt w:val="bullet"/>
+      <w:lvlText w:val=""/>
+      <w:lvlJc w:val="left"/>
+      <w:pPr>
+        <w:ind w:left="2160" w:hanging="360"/>
+      </w:pPr>
+      <w:rPr>
+        <w:rFonts w:ascii="Wingdings" w:hAnsi="Wingdings" w:hint="default"/>
+      </w:rPr>
+    </w:lvl>
+    <w:lvl w:ilvl="3" w:tplc="08090001" w:tentative="1">
+      <w:start w:val="1"/>
+      <w:numFmt w:val="bullet"/>
+      <w:lvlText w:val=""/>
+      <w:lvlJc w:val="left"/>
+      <w:pPr>
+        <w:ind w:left="2880" w:hanging="360"/>
+      </w:pPr>
+      <w:rPr>
+        <w:rFonts w:ascii="Symbol" w:hAnsi="Symbol" w:hint="default"/>
+      </w:rPr>
+    </w:lvl>
+    <w:lvl w:ilvl="4" w:tplc="08090003" w:tentative="1">
+      <w:start w:val="1"/>
+      <w:numFmt w:val="bullet"/>
+      <w:lvlText w:val="o"/>
+      <w:lvlJc w:val="left"/>
+      <w:pPr>
+        <w:ind w:left="3600" w:hanging="360"/>
+      </w:pPr>
+      <w:rPr>
+        <w:rFonts w:ascii="Courier New" w:hAnsi="Courier New" w:cs="Courier New" w:hint="default"/>
+      </w:rPr>
+    </w:lvl>
+    <w:lvl w:ilvl="5" w:tplc="08090005" w:tentative="1">
+      <w:start w:val="1"/>
+      <w:numFmt w:val="bullet"/>
+      <w:lvlText w:val=""/>
+      <w:lvlJc w:val="left"/>
+      <w:pPr>
+        <w:ind w:left="4320" w:hanging="360"/>
+      </w:pPr>
+      <w:rPr>
+        <w:rFonts w:ascii="Wingdings" w:hAnsi="Wingdings" w:hint="default"/>
+      </w:rPr>
+    </w:lvl>
+    <w:lvl w:ilvl="6" w:tplc="08090001" w:tentative="1">
+      <w:start w:val="1"/>
+      <w:numFmt w:val="bullet"/>
+      <w:lvlText w:val=""/>
+      <w:lvlJc w:val="left"/>
+      <w:pPr>
+        <w:ind w:left="5040" w:hanging="360"/>
+      </w:pPr>
+      <w:rPr>
+        <w:rFonts w:ascii="Symbol" w:hAnsi="Symbol" w:hint="default"/>
+      </w:rPr>
+    </w:lvl>
+    <w:lvl w:ilvl="7" w:tplc="08090003" w:tentative="1">
+      <w:start w:val="1"/>
+      <w:numFmt w:val="bullet"/>
+      <w:lvlText w:val="o"/>
+      <w:lvlJc w:val="left"/>
+      <w:pPr>
+        <w:ind w:left="5760" w:hanging="360"/>
+      </w:pPr>
+      <w:rPr>
+        <w:rFonts w:ascii="Courier New" w:hAnsi="Courier New" w:cs="Courier New" w:hint="default"/>
+      </w:rPr>
+    </w:lvl>
+    <w:lvl w:ilvl="8" w:tplc="08090005" w:tentative="1">
+      <w:start w:val="1"/>
+      <w:numFmt w:val="bullet"/>
+      <w:lvlText w:val=""/>
+      <w:lvlJc w:val="left"/>
+      <w:pPr>
+        <w:ind w:left="6480" w:hanging="360"/>
+      </w:pPr>
+      <w:rPr>
+        <w:rFonts w:ascii="Wingdings" w:hAnsi="Wingdings" w:hint="default"/>
+      </w:rPr>
+    </w:lvl>
+  </w:abstractNum>
+  <w:abstractNum w:abstractNumId="31" w15:restartNumberingAfterBreak="0">
     <w:nsid w:val="5C3A72EB"/>
     <w:multiLevelType w:val="multilevel"/>
     <w:tmpl w:val="EF24E2CA"/>
@@ -12226,7 +13151,7 @@
       </w:rPr>
     </w:lvl>
   </w:abstractNum>
-  <w:abstractNum w:abstractNumId="29" w15:restartNumberingAfterBreak="0">
+  <w:abstractNum w:abstractNumId="32" w15:restartNumberingAfterBreak="0">
     <w:nsid w:val="5C3C2268"/>
     <w:multiLevelType w:val="multilevel"/>
     <w:tmpl w:val="630AFAA4"/>
@@ -12375,7 +13300,7 @@
       </w:rPr>
     </w:lvl>
   </w:abstractNum>
-  <w:abstractNum w:abstractNumId="30" w15:restartNumberingAfterBreak="0">
+  <w:abstractNum w:abstractNumId="33" w15:restartNumberingAfterBreak="0">
     <w:nsid w:val="627A3628"/>
     <w:multiLevelType w:val="multilevel"/>
     <w:tmpl w:val="B302D9D0"/>
@@ -12524,7 +13449,7 @@
       </w:rPr>
     </w:lvl>
   </w:abstractNum>
-  <w:abstractNum w:abstractNumId="31" w15:restartNumberingAfterBreak="0">
+  <w:abstractNum w:abstractNumId="34" w15:restartNumberingAfterBreak="0">
     <w:nsid w:val="655F4638"/>
     <w:multiLevelType w:val="hybridMultilevel"/>
     <w:tmpl w:val="3F18EB12"/>
@@ -12637,7 +13562,96 @@
       </w:rPr>
     </w:lvl>
   </w:abstractNum>
-  <w:abstractNum w:abstractNumId="32" w15:restartNumberingAfterBreak="0">
+  <w:abstractNum w:abstractNumId="35" w15:restartNumberingAfterBreak="0">
+    <w:nsid w:val="68BB1CFC"/>
+    <w:multiLevelType w:val="hybridMultilevel"/>
+    <w:tmpl w:val="BD74AF82"/>
+    <w:lvl w:ilvl="0" w:tplc="0809000F">
+      <w:start w:val="1"/>
+      <w:numFmt w:val="decimal"/>
+      <w:lvlText w:val="%1."/>
+      <w:lvlJc w:val="left"/>
+      <w:pPr>
+        <w:ind w:left="720" w:hanging="360"/>
+      </w:pPr>
+      <w:rPr>
+        <w:rFonts w:hint="default"/>
+      </w:rPr>
+    </w:lvl>
+    <w:lvl w:ilvl="1" w:tplc="08090019" w:tentative="1">
+      <w:start w:val="1"/>
+      <w:numFmt w:val="lowerLetter"/>
+      <w:lvlText w:val="%2."/>
+      <w:lvlJc w:val="left"/>
+      <w:pPr>
+        <w:ind w:left="1440" w:hanging="360"/>
+      </w:pPr>
+    </w:lvl>
+    <w:lvl w:ilvl="2" w:tplc="0809001B" w:tentative="1">
+      <w:start w:val="1"/>
+      <w:numFmt w:val="lowerRoman"/>
+      <w:lvlText w:val="%3."/>
+      <w:lvlJc w:val="right"/>
+      <w:pPr>
+        <w:ind w:left="2160" w:hanging="180"/>
+      </w:pPr>
+    </w:lvl>
+    <w:lvl w:ilvl="3" w:tplc="0809000F" w:tentative="1">
+      <w:start w:val="1"/>
+      <w:numFmt w:val="decimal"/>
+      <w:lvlText w:val="%4."/>
+      <w:lvlJc w:val="left"/>
+      <w:pPr>
+        <w:ind w:left="2880" w:hanging="360"/>
+      </w:pPr>
+    </w:lvl>
+    <w:lvl w:ilvl="4" w:tplc="08090019" w:tentative="1">
+      <w:start w:val="1"/>
+      <w:numFmt w:val="lowerLetter"/>
+      <w:lvlText w:val="%5."/>
+      <w:lvlJc w:val="left"/>
+      <w:pPr>
+        <w:ind w:left="3600" w:hanging="360"/>
+      </w:pPr>
+    </w:lvl>
+    <w:lvl w:ilvl="5" w:tplc="0809001B" w:tentative="1">
+      <w:start w:val="1"/>
+      <w:numFmt w:val="lowerRoman"/>
+      <w:lvlText w:val="%6."/>
+      <w:lvlJc w:val="right"/>
+      <w:pPr>
+        <w:ind w:left="4320" w:hanging="180"/>
+      </w:pPr>
+    </w:lvl>
+    <w:lvl w:ilvl="6" w:tplc="0809000F" w:tentative="1">
+      <w:start w:val="1"/>
+      <w:numFmt w:val="decimal"/>
+      <w:lvlText w:val="%7."/>
+      <w:lvlJc w:val="left"/>
+      <w:pPr>
+        <w:ind w:left="5040" w:hanging="360"/>
+      </w:pPr>
+    </w:lvl>
+    <w:lvl w:ilvl="7" w:tplc="08090019" w:tentative="1">
+      <w:start w:val="1"/>
+      <w:numFmt w:val="lowerLetter"/>
+      <w:lvlText w:val="%8."/>
+      <w:lvlJc w:val="left"/>
+      <w:pPr>
+        <w:ind w:left="5760" w:hanging="360"/>
+      </w:pPr>
+    </w:lvl>
+    <w:lvl w:ilvl="8" w:tplc="0809001B" w:tentative="1">
+      <w:start w:val="1"/>
+      <w:numFmt w:val="lowerRoman"/>
+      <w:lvlText w:val="%9."/>
+      <w:lvlJc w:val="right"/>
+      <w:pPr>
+        <w:ind w:left="6480" w:hanging="180"/>
+      </w:pPr>
+    </w:lvl>
+  </w:abstractNum>
+  <w:abstractNum w:abstractNumId="36" w15:restartNumberingAfterBreak="0">
     <w:nsid w:val="6C0B3AC2"/>
     <w:multiLevelType w:val="multilevel"/>
     <w:tmpl w:val="BA9C889E"/>
@@ -12786,7 +13800,7 @@
       </w:rPr>
     </w:lvl>
   </w:abstractNum>
-  <w:abstractNum w:abstractNumId="33" w15:restartNumberingAfterBreak="0">
+  <w:abstractNum w:abstractNumId="37" w15:restartNumberingAfterBreak="0">
     <w:nsid w:val="6E00562D"/>
     <w:multiLevelType w:val="multilevel"/>
     <w:tmpl w:val="8B38752A"/>
@@ -12935,7 +13949,7 @@
       </w:rPr>
     </w:lvl>
   </w:abstractNum>
-  <w:abstractNum w:abstractNumId="34" w15:restartNumberingAfterBreak="0">
+  <w:abstractNum w:abstractNumId="38" w15:restartNumberingAfterBreak="0">
     <w:nsid w:val="6E7852CE"/>
     <w:multiLevelType w:val="multilevel"/>
     <w:tmpl w:val="BA668776"/>
@@ -13084,7 +14098,7 @@
       </w:rPr>
     </w:lvl>
   </w:abstractNum>
-  <w:abstractNum w:abstractNumId="35" w15:restartNumberingAfterBreak="0">
+  <w:abstractNum w:abstractNumId="39" w15:restartNumberingAfterBreak="0">
     <w:nsid w:val="6EC55E16"/>
     <w:multiLevelType w:val="multilevel"/>
     <w:tmpl w:val="8256C32A"/>
@@ -13233,7 +14247,7 @@
       </w:rPr>
     </w:lvl>
   </w:abstractNum>
-  <w:abstractNum w:abstractNumId="36" w15:restartNumberingAfterBreak="0">
+  <w:abstractNum w:abstractNumId="40" w15:restartNumberingAfterBreak="0">
     <w:nsid w:val="76156201"/>
     <w:multiLevelType w:val="multilevel"/>
     <w:tmpl w:val="279288E6"/>
@@ -13382,7 +14396,7 @@
       </w:rPr>
     </w:lvl>
   </w:abstractNum>
-  <w:abstractNum w:abstractNumId="37" w15:restartNumberingAfterBreak="0">
+  <w:abstractNum w:abstractNumId="41" w15:restartNumberingAfterBreak="0">
     <w:nsid w:val="79E81C66"/>
     <w:multiLevelType w:val="multilevel"/>
     <w:tmpl w:val="53F69F10"/>
@@ -13531,7 +14545,7 @@
       </w:rPr>
     </w:lvl>
   </w:abstractNum>
-  <w:abstractNum w:abstractNumId="38" w15:restartNumberingAfterBreak="0">
+  <w:abstractNum w:abstractNumId="42" w15:restartNumberingAfterBreak="0">
     <w:nsid w:val="7C5B7EEC"/>
     <w:multiLevelType w:val="multilevel"/>
     <w:tmpl w:val="E8D6F8D6"/>
@@ -13681,121 +14695,133 @@
     </w:lvl>
   </w:abstractNum>
   <w:num w:numId="1" w16cid:durableId="292903220">
-    <w:abstractNumId w:val="28"/>
+    <w:abstractNumId w:val="31"/>
   </w:num>
   <w:num w:numId="2" w16cid:durableId="1517234741">
-    <w:abstractNumId w:val="30"/>
+    <w:abstractNumId w:val="33"/>
   </w:num>
   <w:num w:numId="3" w16cid:durableId="431097328">
-    <w:abstractNumId w:val="29"/>
+    <w:abstractNumId w:val="32"/>
   </w:num>
   <w:num w:numId="4" w16cid:durableId="1519344357">
     <w:abstractNumId w:val="0"/>
   </w:num>
   <w:num w:numId="5" w16cid:durableId="1696928807">
-    <w:abstractNumId w:val="22"/>
+    <w:abstractNumId w:val="24"/>
   </w:num>
   <w:num w:numId="6" w16cid:durableId="154222819">
-    <w:abstractNumId w:val="26"/>
+    <w:abstractNumId w:val="28"/>
   </w:num>
   <w:num w:numId="7" w16cid:durableId="2055545341">
     <w:abstractNumId w:val="6"/>
   </w:num>
   <w:num w:numId="8" w16cid:durableId="1933511258">
-    <w:abstractNumId w:val="11"/>
+    <w:abstractNumId w:val="13"/>
   </w:num>
   <w:num w:numId="9" w16cid:durableId="983002763">
-    <w:abstractNumId w:val="23"/>
+    <w:abstractNumId w:val="25"/>
   </w:num>
   <w:num w:numId="10" w16cid:durableId="1341421508">
     <w:abstractNumId w:val="5"/>
   </w:num>
   <w:num w:numId="11" w16cid:durableId="1241134944">
-    <w:abstractNumId w:val="32"/>
+    <w:abstractNumId w:val="36"/>
   </w:num>
   <w:num w:numId="12" w16cid:durableId="1985772173">
-    <w:abstractNumId w:val="9"/>
+    <w:abstractNumId w:val="10"/>
   </w:num>
   <w:num w:numId="13" w16cid:durableId="1752190538">
-    <w:abstractNumId w:val="14"/>
+    <w:abstractNumId w:val="16"/>
   </w:num>
   <w:num w:numId="14" w16cid:durableId="1880512962">
-    <w:abstractNumId w:val="18"/>
+    <w:abstractNumId w:val="20"/>
   </w:num>
   <w:num w:numId="15" w16cid:durableId="230236848">
-    <w:abstractNumId w:val="17"/>
+    <w:abstractNumId w:val="19"/>
   </w:num>
   <w:num w:numId="16" w16cid:durableId="679360020">
-    <w:abstractNumId w:val="33"/>
+    <w:abstractNumId w:val="37"/>
   </w:num>
   <w:num w:numId="17" w16cid:durableId="624888581">
-    <w:abstractNumId w:val="27"/>
+    <w:abstractNumId w:val="29"/>
   </w:num>
   <w:num w:numId="18" w16cid:durableId="620965362">
-    <w:abstractNumId w:val="36"/>
+    <w:abstractNumId w:val="40"/>
   </w:num>
   <w:num w:numId="19" w16cid:durableId="1330596501">
-    <w:abstractNumId w:val="35"/>
+    <w:abstractNumId w:val="39"/>
   </w:num>
   <w:num w:numId="20" w16cid:durableId="1985162762">
-    <w:abstractNumId w:val="38"/>
+    <w:abstractNumId w:val="42"/>
   </w:num>
   <w:num w:numId="21" w16cid:durableId="544023144">
     <w:abstractNumId w:val="2"/>
   </w:num>
   <w:num w:numId="22" w16cid:durableId="962728687">
-    <w:abstractNumId w:val="10"/>
+    <w:abstractNumId w:val="12"/>
   </w:num>
   <w:num w:numId="23" w16cid:durableId="1547335364">
     <w:abstractNumId w:val="1"/>
   </w:num>
   <w:num w:numId="24" w16cid:durableId="1073817246">
-    <w:abstractNumId w:val="21"/>
+    <w:abstractNumId w:val="23"/>
   </w:num>
   <w:num w:numId="25" w16cid:durableId="2045515642">
     <w:abstractNumId w:val="8"/>
   </w:num>
   <w:num w:numId="26" w16cid:durableId="510291353">
-    <w:abstractNumId w:val="34"/>
+    <w:abstractNumId w:val="38"/>
   </w:num>
   <w:num w:numId="27" w16cid:durableId="1878470031">
     <w:abstractNumId w:val="4"/>
   </w:num>
   <w:num w:numId="28" w16cid:durableId="1690328211">
-    <w:abstractNumId w:val="12"/>
+    <w:abstractNumId w:val="14"/>
   </w:num>
   <w:num w:numId="29" w16cid:durableId="2129081759">
-    <w:abstractNumId w:val="20"/>
+    <w:abstractNumId w:val="22"/>
   </w:num>
   <w:num w:numId="30" w16cid:durableId="1231770525">
-    <w:abstractNumId w:val="19"/>
+    <w:abstractNumId w:val="21"/>
   </w:num>
   <w:num w:numId="31" w16cid:durableId="1850826519">
     <w:abstractNumId w:val="3"/>
   </w:num>
   <w:num w:numId="32" w16cid:durableId="196436865">
-    <w:abstractNumId w:val="25"/>
+    <w:abstractNumId w:val="27"/>
   </w:num>
   <w:num w:numId="33" w16cid:durableId="1743289289">
-    <w:abstractNumId w:val="24"/>
+    <w:abstractNumId w:val="26"/>
   </w:num>
   <w:num w:numId="34" w16cid:durableId="917984808">
-    <w:abstractNumId w:val="16"/>
+    <w:abstractNumId w:val="18"/>
   </w:num>
   <w:num w:numId="35" w16cid:durableId="1830251370">
-    <w:abstractNumId w:val="37"/>
+    <w:abstractNumId w:val="41"/>
   </w:num>
   <w:num w:numId="36" w16cid:durableId="431047443">
-    <w:abstractNumId w:val="31"/>
+    <w:abstractNumId w:val="34"/>
   </w:num>
   <w:num w:numId="37" w16cid:durableId="1775979835">
     <w:abstractNumId w:val="7"/>
   </w:num>
   <w:num w:numId="38" w16cid:durableId="1910187828">
-    <w:abstractNumId w:val="13"/>
+    <w:abstractNumId w:val="15"/>
   </w:num>
   <w:num w:numId="39" w16cid:durableId="1367178926">
-    <w:abstractNumId w:val="15"/>
+    <w:abstractNumId w:val="17"/>
+  </w:num>
+  <w:num w:numId="40" w16cid:durableId="1735933742">
+    <w:abstractNumId w:val="11"/>
+  </w:num>
+  <w:num w:numId="41" w16cid:durableId="1402946566">
+    <w:abstractNumId w:val="30"/>
+  </w:num>
+  <w:num w:numId="42" w16cid:durableId="1921015113">
+    <w:abstractNumId w:val="9"/>
+  </w:num>
+  <w:num w:numId="43" w16cid:durableId="1663001135">
+    <w:abstractNumId w:val="35"/>
   </w:num>
 </w:numbering>
 </file>

</xml_diff>